<commit_message>
feat(pai): add 2 checkpoint mini tests immediately after concept explanation slides for Aqlan and Mishka
</commit_message>
<xml_diff>
--- a/docs/PAI_Konten_Canva_dan_MiniTest_C3_C4_Bab4.docx
+++ b/docs/PAI_Konten_Canva_dan_MiniTest_C3_C4_Bab4.docx
@@ -14,59 +14,55 @@
       <w:tr>
         <w:tc>
           <w:tcPr>
-            <w:tcW w:type="dxa" w:w="9792"/>
-            <w:shd w:fill="0F766E"/>
+            <w:tcW w:type="dxa" w:w="10224"/>
+            <w:shd w:val="clear" w:color="auto" w:fill="0F766E"/>
             <w:tcMar>
-              <w:top w:w="180" w:type="dxa"/>
-              <w:bottom w:w="180" w:type="dxa"/>
-              <w:left w:w="220" w:type="dxa"/>
-              <w:right w:w="220" w:type="dxa"/>
+              <w:top w:w="240" w:type="dxa"/>
+              <w:bottom w:w="240" w:type="dxa"/>
+              <w:left w:w="260" w:type="dxa"/>
+              <w:right w:w="260" w:type="dxa"/>
             </w:tcMar>
           </w:tcPr>
           <w:p>
             <w:pPr>
-              <w:spacing w:after="40"/>
               <w:jc w:val="center"/>
             </w:pPr>
             <w:r>
               <w:rPr>
                 <w:rFonts w:ascii="Calibri" w:hAnsi="Calibri"/>
                 <w:b/>
-                <w:color w:val="FEF08A"/>
+                <w:color w:val="FDE047"/>
                 <w:sz w:val="20"/>
               </w:rPr>
-              <w:t>⭐ SESI 1 AQLAN (KELAS 4) &amp; SESI 2 MISHKA (KELAS 5) ⭐</w:t>
-              <w:br/>
-            </w:r>
-            <w:r>
-              <w:rPr>
-                <w:rFonts w:ascii="Arial" w:hAnsi="Arial"/>
-                <w:b/>
-                <w:color w:val="FFFFFF"/>
-                <w:sz w:val="26"/>
-              </w:rPr>
-              <w:t>SLIDE KONTEN CANVA (16:9) &amp; MINI TEST C3-C4 • PAI BAB 4</w:t>
+              <w:t>★ SESI 1 AQLAN (KELAS 4) &amp; SESI 2 MISHKA (KELAS 5) ★</w:t>
               <w:br/>
             </w:r>
             <w:r>
               <w:rPr>
                 <w:rFonts w:ascii="Calibri" w:hAnsi="Calibri"/>
+                <w:b/>
+                <w:color w:val="FFFFFF"/>
+                <w:sz w:val="30"/>
+              </w:rPr>
+              <w:t>SLIDE KONTEN CANVA (16:9) &amp; CHECKPOINT MINI TEST • PAI BAB 4</w:t>
+              <w:br/>
+            </w:r>
+            <w:r>
+              <w:rPr>
+                <w:rFonts w:ascii="Calibri" w:hAnsi="Calibri"/>
+                <w:i/>
                 <w:color w:val="E2E8F0"/>
                 <w:sz w:val="19"/>
               </w:rPr>
               <w:t>Kurikulum Merdeka • PKBM Penerus Bangsa • Pendekatan Storytelling Pak Gita Wirjawan</w:t>
               <w:br/>
-              <w:t>Analogi Objek Nyata, Visual Cues 16:9 &amp; Bank Evaluasi Studi Kasus C3-C4</w:t>
+              <w:t>Alur Pedagogis Aktif: Penjelasan 2 Materi (Pengertian &amp; Contoh) ➔ Checkpoint 2 Mini Test</w:t>
             </w:r>
           </w:p>
         </w:tc>
       </w:tr>
     </w:tbl>
-    <w:p>
-      <w:pPr>
-        <w:spacing w:after="60"/>
-      </w:pPr>
-    </w:p>
+    <w:p/>
     <w:tbl>
       <w:tblPr>
         <w:tblW w:type="auto" w:w="0"/>
@@ -79,27 +75,27 @@
       <w:tr>
         <w:tc>
           <w:tcPr>
-            <w:tcW w:type="dxa" w:w="9792"/>
-            <w:shd w:fill="F0F9FF"/>
+            <w:tcW w:type="dxa" w:w="10224"/>
+            <w:shd w:val="clear" w:color="auto" w:fill="F0F9FF"/>
             <w:tcMar>
-              <w:top w:w="130" w:type="dxa"/>
-              <w:bottom w:w="130" w:type="dxa"/>
+              <w:top w:w="160" w:type="dxa"/>
+              <w:bottom w:w="160" w:type="dxa"/>
               <w:left w:w="180" w:type="dxa"/>
               <w:right w:w="180" w:type="dxa"/>
             </w:tcMar>
           </w:tcPr>
           <w:p>
             <w:pPr>
-              <w:spacing w:after="60"/>
+              <w:spacing w:line="276" w:lineRule="auto"/>
             </w:pPr>
             <w:r>
               <w:rPr>
-                <w:rFonts w:ascii="Arial" w:hAnsi="Arial"/>
+                <w:rFonts w:ascii="Calibri" w:hAnsi="Calibri"/>
                 <w:b/>
                 <w:color w:val="0369A1"/>
-                <w:sz w:val="21"/>
+                <w:sz w:val="22"/>
               </w:rPr>
-              <w:t>👦 SESI 1 AQLAN (KELAS 4 SD): RANGKUMAN 10 SLIDE CANVA 16:9 (BAB 4: USIA BALIGH)</w:t>
+              <w:t>👦 SESI 1 AQLAN (KELAS 4 SD): STRUKTUR 10 SLIDE CANVA DENGAN CHECKPOINT MINI TEST</w:t>
               <w:br/>
             </w:r>
             <w:r>
@@ -109,47 +105,7 @@
                 <w:i w:val="0"/>
                 <w:sz w:val="19"/>
               </w:rPr>
-              <w:t>• Slide 1: Cover - Transformasi Ksatria: Menyambut Usia Baligh (Visual 16:9 Skater gagah &amp; jam matahari)</w:t>
-              <w:br/>
-            </w:r>
-            <w:r>
-              <w:rPr>
-                <w:rFonts w:ascii="Calibri" w:hAnsi="Calibri"/>
-                <w:b/>
-                <w:i w:val="0"/>
-                <w:sz w:val="19"/>
-              </w:rPr>
-              <w:t>• Slide 2: Apersepsi - Dari Penumpang Menjadi Nahkoda Kemudi Sendiri (Status Mukallaf)</w:t>
-              <w:br/>
-            </w:r>
-            <w:r>
-              <w:rPr>
-                <w:rFonts w:ascii="Calibri" w:hAnsi="Calibri"/>
-                <w:b/>
-                <w:i w:val="0"/>
-                <w:sz w:val="19"/>
-              </w:rPr>
-              <w:t>• Slide 3: Textbook - Tanda Baligh Menurut Sains Biologi (Suara berat, jakun, dada bidang, keringat)</w:t>
-              <w:br/>
-            </w:r>
-            <w:r>
-              <w:rPr>
-                <w:rFonts w:ascii="Calibri" w:hAnsi="Calibri"/>
-                <w:b/>
-                <w:i w:val="0"/>
-                <w:sz w:val="19"/>
-              </w:rPr>
-              <w:t>• Slide 4: Textbook - Tanda Baligh Menurut Ilmu Fikih (Mimpi basah / ihtilam, batas usia 15 tahun)</w:t>
-              <w:br/>
-            </w:r>
-            <w:r>
-              <w:rPr>
-                <w:rFonts w:ascii="Calibri" w:hAnsi="Calibri"/>
-                <w:b/>
-                <w:i w:val="0"/>
-                <w:sz w:val="19"/>
-              </w:rPr>
-              <w:t>• Slide 5: Keseharian - Mengapa Perlu Mandi Wajib? (Hadas kecil vs hadas besar &amp; larangan ibadah)</w:t>
+              <w:t>• Slide 1: Cover - Transformasi Ksatria: Menyambut Usia Baligh (Visual 16:9 Aqlan di Skatepark)</w:t>
               <w:br/>
             </w:r>
             <w:r>
@@ -160,17 +116,7 @@
                 <w:color w:val="0369A1"/>
                 <w:sz w:val="19"/>
               </w:rPr>
-              <w:t>• Slide 6: Fikih Aksi - Dua Kunci Sah Mandi Wajib: Cuci Bersih Total (Niat di hati &amp; siram rata rambut ke kaki)</w:t>
-              <w:br/>
-            </w:r>
-            <w:r>
-              <w:rPr>
-                <w:rFonts w:ascii="Calibri" w:hAnsi="Calibri"/>
-                <w:b/>
-                <w:i w:val="0"/>
-                <w:sz w:val="19"/>
-              </w:rPr>
-              <w:t>• Slide 7: Textbook - Tugas Mulia Ksatria Mukallaf (Salat 5 waktu mandiri, tutup aurat, akhlak santun)</w:t>
+              <w:t>• Slide 2: MATERI 1 (Pengertian) - Dari Penumpang Menjadi Nahkoda Kemudi Sendiri (Status Mukallaf)</w:t>
               <w:br/>
             </w:r>
             <w:r>
@@ -181,7 +127,59 @@
                 <w:color w:val="0369A1"/>
                 <w:sz w:val="19"/>
               </w:rPr>
-              <w:t>• Slide 8: Keseharian - Dua Buku Rekening Amal (Malaikat Raqib catat kebaikan, Malaikat Atid catat salah)</w:t>
+              <w:t>• Slide 3: MATERI 2A (Contoh Biologi) - Tanda Baligh Menurut Sains (Suara berat, jakun, dada bidang, keringat)</w:t>
+              <w:br/>
+            </w:r>
+            <w:r>
+              <w:rPr>
+                <w:rFonts w:ascii="Calibri" w:hAnsi="Calibri"/>
+                <w:b/>
+                <w:i w:val="0"/>
+                <w:color w:val="0369A1"/>
+                <w:sz w:val="19"/>
+              </w:rPr>
+              <w:t>• Slide 4: MATERI 2B (Contoh Fikih) - Tanda Baligh Menurut Syariat Fikih (Mimpi basah / ihtilam &amp; usia 15 tahun)</w:t>
+              <w:br/>
+            </w:r>
+            <w:r>
+              <w:rPr>
+                <w:rFonts w:ascii="Calibri" w:hAnsi="Calibri"/>
+                <w:b/>
+                <w:i w:val="0"/>
+                <w:color w:val="B45309"/>
+                <w:sz w:val="20"/>
+              </w:rPr>
+              <w:t>★ SLIDE 5: 🎯 CHECKPOINT 2 MINI TEST KSATRIA (Uji Pemahaman Langsung Materi 1 &amp; 2)</w:t>
+              <w:br/>
+            </w:r>
+            <w:r>
+              <w:rPr>
+                <w:rFonts w:ascii="Calibri" w:hAnsi="Calibri"/>
+                <w:b/>
+                <w:i w:val="0"/>
+                <w:sz w:val="19"/>
+              </w:rPr>
+              <w:t>• Slide 6: MATERI 3 (Thaharah) - Mengapa Perlu Mandi Wajib? (Hadas kecil vs hadas besar &amp; larangan ibadah)</w:t>
+              <w:br/>
+            </w:r>
+            <w:r>
+              <w:rPr>
+                <w:rFonts w:ascii="Calibri" w:hAnsi="Calibri"/>
+                <w:b/>
+                <w:i w:val="0"/>
+                <w:sz w:val="19"/>
+              </w:rPr>
+              <w:t>• Slide 7: MATERI 4 (Fikih Aksi) - Dua Kunci Sah Mandi Wajib: Cuci Bersih Total (Niat di hati &amp; siram rata)</w:t>
+              <w:br/>
+            </w:r>
+            <w:r>
+              <w:rPr>
+                <w:rFonts w:ascii="Calibri" w:hAnsi="Calibri"/>
+                <w:b/>
+                <w:i w:val="0"/>
+                <w:sz w:val="19"/>
+              </w:rPr>
+              <w:t>• Slide 8: Keseharian &amp; Karakter - Dua Buku Rekening Amal (Malaikat Raqib catat kebaikan, Atid catat salah)</w:t>
               <w:br/>
             </w:r>
             <w:r>
@@ -201,18 +199,14 @@
                 <w:i w:val="0"/>
                 <w:sz w:val="19"/>
               </w:rPr>
-              <w:t>• Slide 10: Aksi Nyata - Tantangan Ksatria Mandiri &amp; Pengerjaan Game Web PAI 400 Poin</w:t>
+              <w:t>• Slide 10: Aksi Nyata - Misi Ksatria Mandiri &amp; Evaluasi Final Game Web PAI 400 Poin</w:t>
               <w:br/>
             </w:r>
           </w:p>
         </w:tc>
       </w:tr>
     </w:tbl>
-    <w:p>
-      <w:pPr>
-        <w:spacing w:after="60"/>
-      </w:pPr>
-    </w:p>
+    <w:p/>
     <w:tbl>
       <w:tblPr>
         <w:tblW w:type="auto" w:w="0"/>
@@ -225,27 +219,27 @@
       <w:tr>
         <w:tc>
           <w:tcPr>
-            <w:tcW w:type="dxa" w:w="9792"/>
-            <w:shd w:fill="F8FAFC"/>
+            <w:tcW w:type="dxa" w:w="10224"/>
+            <w:shd w:val="clear" w:color="auto" w:fill="FEF3C7"/>
             <w:tcMar>
-              <w:top w:w="130" w:type="dxa"/>
-              <w:bottom w:w="130" w:type="dxa"/>
+              <w:top w:w="160" w:type="dxa"/>
+              <w:bottom w:w="160" w:type="dxa"/>
               <w:left w:w="180" w:type="dxa"/>
               <w:right w:w="180" w:type="dxa"/>
             </w:tcMar>
           </w:tcPr>
           <w:p>
             <w:pPr>
-              <w:spacing w:after="60"/>
+              <w:spacing w:line="276" w:lineRule="auto"/>
             </w:pPr>
             <w:r>
               <w:rPr>
-                <w:rFonts w:ascii="Arial" w:hAnsi="Arial"/>
+                <w:rFonts w:ascii="Calibri" w:hAnsi="Calibri"/>
                 <w:b/>
-                <w:color w:val="1E293B"/>
-                <w:sz w:val="21"/>
+                <w:color w:val="B45309"/>
+                <w:sz w:val="22"/>
               </w:rPr>
-              <w:t>📝 MINI TEST 4 SOAL PILIHAN GANDA AQLAN (LEVEL C3-C4)</w:t>
+              <w:t>🎯 SLIDE 5: CHECKPOINT 2 MINI TEST AQLAN (SETELAH PENJELASAN MATERI 1 &amp; 2)</w:t>
               <w:br/>
             </w:r>
             <w:r>
@@ -256,7 +250,7 @@
                 <w:color w:val="0369A1"/>
                 <w:sz w:val="19"/>
               </w:rPr>
-              <w:t>Soal 1 (Level C3 - Klasifikasi Tanda Baligh Sains vs Fikih):</w:t>
+              <w:t>SOAL 1 (Level C3 - Klasifikasi Tanda Biologi vs Ciri Fikih):</w:t>
               <w:br/>
             </w:r>
             <w:r>
@@ -266,15 +260,17 @@
                 <w:i w:val="0"/>
                 <w:sz w:val="18"/>
               </w:rPr>
-              <w:t>Saat berdiskusi di sekolah, Aqlan mengamati beberapa tanda perubahan pada dirinya dan teman-temannya. Manakah perpaduan tanda baligh menurut ilmu biologi dan ilmu fikih bagi seorang laki-laki yang paling tepat?</w:t>
+              <w:t>Aqlan dan teman-temannya di kelas 4 sedang mendiskusikan perubahan tubuh mereka. Aqlan mencatat ada perubahan fisik seperti jakun di leher yang membesar dan suara yang bertambah berat, serta ada tanda fikih syariat seperti mengalami mimpi basah (ihtilam). Berdasarkan ilmu sains biologi dan ilmu fikih Islam, pernyataan di bawah ini yang paling tepat dalam mengklasifikasikan tanda kedewasaan laki-laki adalah...</w:t>
               <w:br/>
-              <w:t>A. Suara bertambah nyaring melengking dan sering berolahraga lari</w:t>
+              <w:t>A. Tumbuhnya jakun adalah tanda fikih, sedangkan mimpi basah adalah tanda biologi biasa.</w:t>
               <w:br/>
-              <w:t>B. Jakun mulai membesar di leher (biologi) dan mengalami mimpi basah / ihtilam (fikih)  [KUNCI: B]</w:t>
+              <w:t>B. Tumbuhnya jakun dan suara berat adalah transformasi fisik biologi, sedangkan mimpi basah (ihtilam) adalah tanda sah fikih kedewasaan syariat.  [KUNCI: B]</w:t>
               <w:br/>
-              <w:t>C. Memiliki tubuh yang tinggi dan suka bermain skateboard hingga sore</w:t>
+              <w:t>C. Semua perubahan tubuh hanya terjadi karena sering berolahraga skateboard di sore hari.</w:t>
               <w:br/>
-              <w:t>D. Menginjak usia 10 tahun dan hafal juz 30 Al-Qur'an</w:t>
+              <w:t>D. Laki-laki hanya bisa dikatakan baligh jika tinggi badannya sudah mencapai 160 cm.</w:t>
+              <w:br/>
+              <w:t>💡 Pembahasan: Sains biologi menjelaskan perubahan hormon dan fisik (suara berat, jakun, dada bidang, keringat). Sedangkan fikih Islam menetapkan batas hukum sah seseorang memasuki fase kedewasaan melalui peristiwa mimpi basah (ihtilam) atau genap berusia 15 tahun.</w:t>
               <w:br/>
               <w:br/>
             </w:r>
@@ -286,7 +282,7 @@
                 <w:color w:val="0369A1"/>
                 <w:sz w:val="19"/>
               </w:rPr>
-              <w:t>Soal 2 (Level C4 - Analisis Sahnya Mandi Wajib Dua Kunci Bersuci):</w:t>
+              <w:t>SOAL 2 (Level C4 - Analisis Konsep Status Mukallaf / Lisensi Nahkoda):</w:t>
               <w:br/>
             </w:r>
             <w:r>
@@ -296,86 +292,24 @@
                 <w:i w:val="0"/>
                 <w:sz w:val="18"/>
               </w:rPr>
-              <w:t>Rian bangun pagi dan menyadari mengalami mimpi basah. Karena takut terlambat salat subuh, Rian langsung mandi menyiram badan dengan sabun wangi, namun lupa berniat di hati dan rambut belakangnya masih ada yang kering belum basah. Berdasarkan dua syarat sah mandi wajib, status bersuci Rian adalah...</w:t>
+              <w:t>Doni telah genap berusia 15 tahun dan sudah mengalami mimpi basah (ihtilam). Suatu hari, Doni berkata kepada temannya: 'Aku kan sudah baligh, berarti aku bebas main skateboard sampai larut malam dan tidak perlu salat kalau lagi capek, karena sudah bukan anak kecil yang disuruh orang tua lagi.' Berdasarkan konsep status Mukallaf (Lisensi Nahkoda Sendiri), analisis yang paling tepat terhadap perkataan Doni adalah...</w:t>
               <w:br/>
-              <w:t>A. Sah, karena sudah memakai sabun wangi dan badannya segar</w:t>
+              <w:t>A. Perkataan Doni benar, karena anak yang sudah baligh bebas dari aturan apa pun di rumah.</w:t>
               <w:br/>
-              <w:t>B. Sah, karena yang terpenting adalah niat salat subuh di masjid</w:t>
+              <w:t>B. Perkataan Doni keliru, karena menjadi Mukallaf berarti ia telah memegang kemudi catatan amalnya sendiri di hadapan Allah, sehingga salat fardhu 5 waktu menjadi kewajiban mutlak yang harus didirikan secara mandiri dan berdosa jika ditinggalkan.  [KUNCI: B]</w:t>
               <w:br/>
-              <w:t>C. Tidak sah, karena melanggar kedua syarat wajib: tidak ada niat mengangkat hadas besar di hati dan air belum merata ke seluruh tubuh termasuk rambut  [KUNCI: C]</w:t>
+              <w:t>C. Perkataan Doni benar, asalkan ia tetap meminta izin kepada orang tuanya sebelum bermain.</w:t>
               <w:br/>
-              <w:t>D. Tidak sah, karena belum berolahraga pagi sebelum mandi</w:t>
+              <w:t>D. Perkataan Doni keliru hanya karena ia bermain skateboard di malam hari, bukan karena meninggalkan salatnya.</w:t>
               <w:br/>
-              <w:br/>
-            </w:r>
-            <w:r>
-              <w:rPr>
-                <w:rFonts w:ascii="Calibri" w:hAnsi="Calibri"/>
-                <w:b/>
-                <w:i w:val="0"/>
-                <w:color w:val="0369A1"/>
-                <w:sz w:val="19"/>
-              </w:rPr>
-              <w:t>Soal 3 (Level C4 - Analisis Konsep Status Mukallaf / Lisensi Nahkoda):</w:t>
-              <w:br/>
-            </w:r>
-            <w:r>
-              <w:rPr>
-                <w:rFonts w:ascii="Calibri" w:hAnsi="Calibri"/>
-                <w:b w:val="0"/>
-                <w:i w:val="0"/>
-                <w:sz w:val="18"/>
-              </w:rPr>
-              <w:t>Sejak memasuki usia baligh, seorang muslim resmi menyandang status sebagai Mukallaf. Konsekuensi spiritual paling penting dari perubahan status menjadi mukallaf dalam kehidupan sehari-hari adalah...</w:t>
-              <w:br/>
-              <w:t>A. Segala perbuatan baik dan buruk kini mulai dicatat langsung atas nama dirinya sendiri dan wajib mendirikan salat fardhu secara mandiri  [KUNCI: A]</w:t>
-              <w:br/>
-              <w:t>B. Boleh menentukan sendiri apakah ingin salat atau tidak sesuai suasana hati</w:t>
-              <w:br/>
-              <w:t>C. Orang tua tidak boleh lagi mengingatkan atau menasihati anaknya di rumah</w:t>
-              <w:br/>
-              <w:t>D. Semua dosa dan kesalahan otomatis dimaafkan tanpa perlu bertobat</w:t>
-              <w:br/>
-              <w:br/>
-            </w:r>
-            <w:r>
-              <w:rPr>
-                <w:rFonts w:ascii="Calibri" w:hAnsi="Calibri"/>
-                <w:b/>
-                <w:i w:val="0"/>
-                <w:color w:val="0369A1"/>
-                <w:sz w:val="19"/>
-              </w:rPr>
-              <w:t>Soal 4 (Level C3 - Penerapan Adab Hadas Besar):</w:t>
-              <w:br/>
-            </w:r>
-            <w:r>
-              <w:rPr>
-                <w:rFonts w:ascii="Calibri" w:hAnsi="Calibri"/>
-                <w:b w:val="0"/>
-                <w:i w:val="0"/>
-                <w:sz w:val="18"/>
-              </w:rPr>
-              <w:t>Faris mengalami mimpi basah di hari Minggu pagi. Sesaat setelah bangun tidur, Faris melihat adik perempuannya membaca Al-Qur'an dan ibunya mengajaknya salat dhuha. Tindakan yang paling tepat dan beradab dilakukan Faris sebelum melaksanakan ibadah tersebut adalah...</w:t>
-              <w:br/>
-              <w:t>A. Langsung mengambil wudu seperti biasa tanpa mandi karena hanya mimpi</w:t>
-              <w:br/>
-              <w:t>B. Cukup mencuci tangan dan berganti pakaian baru yang wangi</w:t>
-              <w:br/>
-              <w:t>C. Melakukan mandi wajib (ghusl) dengan niat yang benar dan mengguyur air merata ke seluruh tubuh terlebih dahulu  [KUNCI: C]</w:t>
-              <w:br/>
-              <w:t>D. Menunggu waktu salat dzuhur tiba baru mandi</w:t>
+              <w:t>💡 Pembahasan: Mukallaf (Lisensi Nahkoda Sendiri) bukan berarti bebas tanpa aturan, melainkan memikul tanggung jawab (taklif) syariat. Seluruh perbuatan kini dicatat langsung atas nama dirinya oleh Malaikat Raqib dan Atid.</w:t>
               <w:br/>
             </w:r>
           </w:p>
         </w:tc>
       </w:tr>
     </w:tbl>
-    <w:p>
-      <w:pPr>
-        <w:spacing w:after="60"/>
-      </w:pPr>
-    </w:p>
+    <w:p/>
     <w:tbl>
       <w:tblPr>
         <w:tblW w:type="auto" w:w="0"/>
@@ -388,27 +322,27 @@
       <w:tr>
         <w:tc>
           <w:tcPr>
-            <w:tcW w:type="dxa" w:w="9792"/>
-            <w:shd w:fill="ECFDF5"/>
+            <w:tcW w:type="dxa" w:w="10224"/>
+            <w:shd w:val="clear" w:color="auto" w:fill="ECFDF5"/>
             <w:tcMar>
-              <w:top w:w="130" w:type="dxa"/>
-              <w:bottom w:w="130" w:type="dxa"/>
+              <w:top w:w="160" w:type="dxa"/>
+              <w:bottom w:w="160" w:type="dxa"/>
               <w:left w:w="180" w:type="dxa"/>
               <w:right w:w="180" w:type="dxa"/>
             </w:tcMar>
           </w:tcPr>
           <w:p>
             <w:pPr>
-              <w:spacing w:after="60"/>
+              <w:spacing w:line="276" w:lineRule="auto"/>
             </w:pPr>
             <w:r>
               <w:rPr>
-                <w:rFonts w:ascii="Arial" w:hAnsi="Arial"/>
+                <w:rFonts w:ascii="Calibri" w:hAnsi="Calibri"/>
                 <w:b/>
                 <w:color w:val="047857"/>
-                <w:sz w:val="21"/>
+                <w:sz w:val="22"/>
               </w:rPr>
-              <w:t>👧 SESI 2 MISHKA (KELAS 5 SD): RANGKUMAN 10 SLIDE CANVA 16:9 (BAB 4: BERBAGI)</w:t>
+              <w:t>👧 SESI 2 MISHKA (KELAS 5 SD): STRUKTUR 10 SLIDE CANVA DENGAN CHECKPOINT MINI TEST</w:t>
               <w:br/>
             </w:r>
             <w:r>
@@ -418,17 +352,7 @@
                 <w:i w:val="0"/>
                 <w:sz w:val="19"/>
               </w:rPr>
-              <w:t>• Slide 1: Cover - Seni Kasih Sayang Islam: Hidup Lapang dengan Berbagi (Visual 16:9 Muslimah &amp; kado emas)</w:t>
-              <w:br/>
-            </w:r>
-            <w:r>
-              <w:rPr>
-                <w:rFonts w:ascii="Calibri" w:hAnsi="Calibri"/>
-                <w:b/>
-                <w:i w:val="0"/>
-                <w:sz w:val="19"/>
-              </w:rPr>
-              <w:t>• Slide 2: Apersepsi - Mengapa Tangan di Atas Lebih Mulia? (Sabda Nabi saw. H.R. Bukhari)</w:t>
+              <w:t>• Slide 1: Cover - Seni Kasih Sayang Islam: Hidup Lapang dengan Berbagi (Visual 16:9 Mishka di Taman)</w:t>
               <w:br/>
             </w:r>
             <w:r>
@@ -439,7 +363,7 @@
                 <w:color w:val="047857"/>
                 <w:sz w:val="19"/>
               </w:rPr>
-              <w:t>• Slide 3: Textbook - Cabang 1: ZAKAT (Akar Kokoh: Kewajiban Tertakar Nisab, Haul, 8 Asnaf)</w:t>
+              <w:t>• Slide 2: MATERI 1 (Pengertian) - Apersepsi: Keanggunan 'Tangan di Atas' (Hadis Bukhari &amp; Hakikat Berbagi)</w:t>
               <w:br/>
             </w:r>
             <w:r>
@@ -450,7 +374,7 @@
                 <w:color w:val="047857"/>
                 <w:sz w:val="19"/>
               </w:rPr>
-              <w:t>• Slide 4: Textbook - Cabang 2: INFAK (Batang Utama: Uang Sukarela Kapan Saja untuk Sarana Umum)</w:t>
+              <w:t>• Slide 3: Master Visual - Pohon Kebaikan Bermahkota Sakura (File visual_pohon_kebaikan_sakura.jpg)</w:t>
               <w:br/>
             </w:r>
             <w:r>
@@ -461,7 +385,7 @@
                 <w:color w:val="047857"/>
                 <w:sz w:val="19"/>
               </w:rPr>
-              <w:t>• Slide 5: Textbook - Cabang 3: SEDEKAH (Ranting &amp; Daun Rimbun: Kebaikan Materi &amp; Non-Materi Paling Luas)</w:t>
+              <w:t>• Slide 4: MATERI 2 (Contoh Nyata) - Cabang 1: Zakat (Akar Tertakar) &amp; Cabang 2: Infak (Batang Sukarela)</w:t>
               <w:br/>
             </w:r>
             <w:r>
@@ -469,43 +393,10 @@
                 <w:rFonts w:ascii="Calibri" w:hAnsi="Calibri"/>
                 <w:b/>
                 <w:i w:val="0"/>
-                <w:color w:val="047857"/>
-                <w:sz w:val="19"/>
+                <w:color w:val="BE185D"/>
+                <w:sz w:val="20"/>
               </w:rPr>
-              <w:t>• Slide 6: Textbook - Cabang 4: HADIAH (Bunga Semerbak: Apresiasi &amp; Tanda Kasih Persahabatan Tahadu Tahabbu)</w:t>
-              <w:br/>
-            </w:r>
-            <w:r>
-              <w:rPr>
-                <w:rFonts w:ascii="Calibri" w:hAnsi="Calibri"/>
-                <w:b/>
-                <w:i w:val="0"/>
-                <w:color w:val="047857"/>
-                <w:sz w:val="19"/>
-              </w:rPr>
-              <w:t>• Slide 7: Infografis Terpadu - Peta Empat Cabang Pohon Kebaikan (Tabel Analisis Presisi Komparatif)</w:t>
-              <w:br/>
-            </w:r>
-            <w:r>
-              <w:rPr>
-                <w:rFonts w:ascii="Calibri" w:hAnsi="Calibri"/>
-                <w:b/>
-                <w:i w:val="0"/>
-                <w:color w:val="DC2626"/>
-                <w:sz w:val="19"/>
-              </w:rPr>
-              <w:t>• Slide 8: Keseharian &amp; Karakter - Bahaya 'Batu Licin Tersapu Badai' (Mengungkit Al-Mann &amp; Sakiti Hati Al-Adza)</w:t>
-              <w:br/>
-            </w:r>
-            <w:r>
-              <w:rPr>
-                <w:rFonts w:ascii="Calibri" w:hAnsi="Calibri"/>
-                <w:b/>
-                <w:i w:val="0"/>
-                <w:color w:val="047857"/>
-                <w:sz w:val="19"/>
-              </w:rPr>
-              <w:t>• Slide 9: Karakter Luhur - Keanggunan 'Tangan di Atas' (Ikhlas Tanpa Kamera, Rahasia Tangan Kanan, Muliakan Sahabat)</w:t>
+              <w:t>★ SLIDE 5: 🎯 CHECKPOINT 2 MINI TEST DUTA KEBAIKAN (Uji Pemahaman Langsung Materi 1 &amp; 2)</w:t>
               <w:br/>
             </w:r>
             <w:r>
@@ -515,18 +406,54 @@
                 <w:i w:val="0"/>
                 <w:sz w:val="19"/>
               </w:rPr>
-              <w:t>• Slide 10: Aksi Nyata - Misi Ksatria Berbagi &amp; Pengerjaan Game Web PAI 400 Poin</w:t>
+              <w:t>• Slide 6: MATERI 3 &amp; 4 (Sedekah &amp; Hadiah) - Ranting Kebaikan Semesta &amp; Hadiah Bunga Sakura (Tahadu Tahabbu)</w:t>
+              <w:br/>
+            </w:r>
+            <w:r>
+              <w:rPr>
+                <w:rFonts w:ascii="Calibri" w:hAnsi="Calibri"/>
+                <w:b/>
+                <w:i w:val="0"/>
+                <w:sz w:val="19"/>
+              </w:rPr>
+              <w:t>• Slide 7: Infografis Komparasi - Peta Matriks Master Empat Cabang Kebaikan</w:t>
+              <w:br/>
+            </w:r>
+            <w:r>
+              <w:rPr>
+                <w:rFonts w:ascii="Calibri" w:hAnsi="Calibri"/>
+                <w:b/>
+                <w:i w:val="0"/>
+                <w:sz w:val="19"/>
+              </w:rPr>
+              <w:t>• Slide 8: Keseharian &amp; Karakter - Bahaya 'Batu Licin Tersapu Badai' (Al-Mann &amp; Al-Adza / Q.S. Al-Baqarah: 264)</w:t>
+              <w:br/>
+            </w:r>
+            <w:r>
+              <w:rPr>
+                <w:rFonts w:ascii="Calibri" w:hAnsi="Calibri"/>
+                <w:b/>
+                <w:i w:val="0"/>
+                <w:sz w:val="19"/>
+              </w:rPr>
+              <w:t>• Slide 9: Karakter Luhur - Keanggunan Berbagi: Tanpa Kamera Medsos &amp; Menjaga Martabat Sahabat</w:t>
+              <w:br/>
+            </w:r>
+            <w:r>
+              <w:rPr>
+                <w:rFonts w:ascii="Calibri" w:hAnsi="Calibri"/>
+                <w:b/>
+                <w:i w:val="0"/>
+                <w:sz w:val="19"/>
+              </w:rPr>
+              <w:t>• Slide 10: Aksi Nyata - Misi Duta Kasih Sayang &amp; Evaluasi Final Game Web PAI 400 Poin</w:t>
               <w:br/>
             </w:r>
           </w:p>
         </w:tc>
       </w:tr>
     </w:tbl>
-    <w:p>
-      <w:pPr>
-        <w:spacing w:after="60"/>
-      </w:pPr>
-    </w:p>
+    <w:p/>
     <w:tbl>
       <w:tblPr>
         <w:tblW w:type="auto" w:w="0"/>
@@ -539,27 +466,27 @@
       <w:tr>
         <w:tc>
           <w:tcPr>
-            <w:tcW w:type="dxa" w:w="9792"/>
-            <w:shd w:fill="F8FAFC"/>
+            <w:tcW w:type="dxa" w:w="10224"/>
+            <w:shd w:val="clear" w:color="auto" w:fill="FCE7F3"/>
             <w:tcMar>
-              <w:top w:w="130" w:type="dxa"/>
-              <w:bottom w:w="130" w:type="dxa"/>
+              <w:top w:w="160" w:type="dxa"/>
+              <w:bottom w:w="160" w:type="dxa"/>
               <w:left w:w="180" w:type="dxa"/>
               <w:right w:w="180" w:type="dxa"/>
             </w:tcMar>
           </w:tcPr>
           <w:p>
             <w:pPr>
-              <w:spacing w:after="60"/>
+              <w:spacing w:line="276" w:lineRule="auto"/>
             </w:pPr>
             <w:r>
               <w:rPr>
-                <w:rFonts w:ascii="Arial" w:hAnsi="Arial"/>
+                <w:rFonts w:ascii="Calibri" w:hAnsi="Calibri"/>
                 <w:b/>
-                <w:color w:val="1E293B"/>
-                <w:sz w:val="21"/>
+                <w:color w:val="BE185D"/>
+                <w:sz w:val="22"/>
               </w:rPr>
-              <w:t>📝 MINI TEST 4 SOAL PILIHAN GANDA MISHKA (LEVEL C3-C4)</w:t>
+              <w:t>🎯 SLIDE 5: CHECKPOINT 2 MINI TEST MISHKA (SETELAH PENJELASAN MATERI 1 &amp; 2)</w:t>
               <w:br/>
             </w:r>
             <w:r>
@@ -570,7 +497,7 @@
                 <w:color w:val="047857"/>
                 <w:sz w:val="19"/>
               </w:rPr>
-              <w:t>Soal 1 (Level C3 - Mengklasifikasikan 4 Bentuk Berbagi Pohon Kebaikan):</w:t>
+              <w:t>SOAL 1 (Level C3 - Klasifikasi Karakteristik Zakat vs Infak):</w:t>
               <w:br/>
             </w:r>
             <w:r>
@@ -580,15 +507,17 @@
                 <w:i w:val="0"/>
                 <w:sz w:val="18"/>
               </w:rPr>
-              <w:t>Amati 4 peristiwa: 1) Pak Ahmad bayar 2.5 kg beras Idulfitri, 2) Zahra infak Rp 20.000 ke kotak amal mushola, 3) Mishka senyum tulus dan singkirkan ranting di jalan, 4) Nayla beri buku cerita kado ultah sahabat. Urutan jenis amalan secara berturut-turut adalah...</w:t>
+              <w:t>Bu Tiara menjelaskan bahwa di dalam Pohon Kebaikan, Zakat diibaratkan sebagai Akar Penopang yang tertakar, sedangkan Infak diibaratkan sebagai Batang Aliran dana sukarela. Manakah di bawah ini yang paling tepat membedakan antara Zakat dan Infak dalam kehidupan sehari-hari?</w:t>
               <w:br/>
-              <w:t>A. Infak, Zakat, Hadiah, Sedekah</w:t>
+              <w:t>A. Zakat hukumnya sunnah dan bebas kapan saja, sedangkan Infak hukumnya wajib setiap hari raya.</w:t>
               <w:br/>
-              <w:t>B. Zakat, Infak, Sedekah, Hadiah  [KUNCI: B]</w:t>
+              <w:t>B. Zakat hukumnya wajib dengan batas minimal tertentu (Nisab &amp; Haul), sedangkan Infak hukumnya sunnah sukarela tanpa batas jumlah dan waktu tertentu.  [KUNCI: B]</w:t>
               <w:br/>
-              <w:t>C. Sedekah, Zakat, Infak, Hadiah</w:t>
+              <w:t>C. Zakat hanya boleh diberikan berupa pakaian, sedangkan Infak harus berupa beras 2,5 kg.</w:t>
               <w:br/>
-              <w:t>D. Hadiah, Sedekah, Infak, Zakat</w:t>
+              <w:t>D. Zakat dan Infak memiliki aturan yang persis sama tanpa ada perbedaan hukum.</w:t>
+              <w:br/>
+              <w:t>💡 Pembahasan: Zakat adalah rukun Islam yang hukumnya wajib (fardhu 'ain) dan terikat ketentuan nisab serta haul. Sementara infak adalah amalan sunnah sukarela yang fleksibel dan bisa dikeluarkan berapapun nominalnya kapan saja.</w:t>
               <w:br/>
               <w:br/>
             </w:r>
@@ -600,7 +529,7 @@
                 <w:color w:val="047857"/>
                 <w:sz w:val="19"/>
               </w:rPr>
-              <w:t>Soal 2 (Level C4 - Analisis Pembatal Pahala Sedekah Q.S. Al-Baqarah: 264):</w:t>
+              <w:t>SOAL 2 (Level C4 - Analisis Keanggunan Tangan di Atas &amp; Adab Berbagi):</w:t>
               <w:br/>
             </w:r>
             <w:r>
@@ -610,16 +539,57 @@
                 <w:i w:val="0"/>
                 <w:sz w:val="18"/>
               </w:rPr>
-              <w:t>Dinda menyumbang alat warna ke teman kurang mampu. Seminggu kemudian saat berselisih, Dinda berteriak: "Ingat ya, pensil warna itu kan aku yang belikan!". Berdasarkan analogi Batu Licin Tersapu Badai, amalan Dinda...</w:t>
+              <w:t>Zahra memiliki sisa uang tabungan dan ingin mempraktikkan ajaran Nabi saw. tentang keutamaan 'Tangan di Atas'. Zahra melihat seorang teman sekelasnya kesulitan membeli buku modul belajar. Sikap berbagi yang paling mencerminkan Keanggunan Tangan di Atas menurut ajaran Islam adalah...</w:t>
               <w:br/>
-              <w:t>A. Tetap berpahala penuh karena pensil warna sudah terlanjur dipakai</w:t>
+              <w:t>A. Membelikan buku tersebut lalu memfotonya bersama teman dan mengunggahnya ke media sosial agar dilihat banyak orang.</w:t>
               <w:br/>
-              <w:t>B. Pahalanya terhapus dan sirna karena telah melakukan Al-Mann (mengungkit) dan Al-Adza (menyakiti perasaan teman)  [KUNCI: B]</w:t>
+              <w:t>B. Memberikan buku tersebut secara diam-diam dengan santun tanpa merendahkan atau mempermalukan martabat temannya.  [KUNCI: B]</w:t>
               <w:br/>
-              <w:t>C. Mendapat pahala setengah karena temannya memang pantas ditegur</w:t>
+              <w:t>C. Mengumumkan di depan kelas bahwa dirinya yang telah membantu membelikan buku tersebut.</w:t>
               <w:br/>
-              <w:t>D. Bertambah berkah karena Dinda mengingatkan kebaikan masa lalu</w:t>
+              <w:t>D. Meminjamkan buku dengan syarat temannya harus mengerjakan tugas sekolah Zahra selama seminggu.</w:t>
               <w:br/>
+              <w:t>💡 Pembahasan: Keanggunan tangan di atas mengajarkan keikhlasan ('tangan kanan memberi, tangan kiri tidak tahu'), menjauhi riya' (pamer konten), dan menjaga kehormatan serta perasaan orang yang dibantu.</w:t>
+              <w:br/>
+            </w:r>
+          </w:p>
+        </w:tc>
+      </w:tr>
+    </w:tbl>
+    <w:p/>
+    <w:tbl>
+      <w:tblPr>
+        <w:tblW w:type="auto" w:w="0"/>
+        <w:jc w:val="center"/>
+        <w:tblLook w:firstColumn="1" w:firstRow="1" w:lastColumn="0" w:lastRow="0" w:noHBand="0" w:noVBand="1" w:val="04A0"/>
+      </w:tblPr>
+      <w:tblGrid>
+        <w:gridCol w:w="10224"/>
+      </w:tblGrid>
+      <w:tr>
+        <w:tc>
+          <w:tcPr>
+            <w:tcW w:type="dxa" w:w="10224"/>
+            <w:shd w:val="clear" w:color="auto" w:fill="F5F3FF"/>
+            <w:tcMar>
+              <w:top w:w="160" w:type="dxa"/>
+              <w:bottom w:w="160" w:type="dxa"/>
+              <w:left w:w="180" w:type="dxa"/>
+              <w:right w:w="180" w:type="dxa"/>
+            </w:tcMar>
+          </w:tcPr>
+          <w:p>
+            <w:pPr>
+              <w:spacing w:line="276" w:lineRule="auto"/>
+            </w:pPr>
+            <w:r>
+              <w:rPr>
+                <w:rFonts w:ascii="Calibri" w:hAnsi="Calibri"/>
+                <w:b/>
+                <w:color w:val="7C3AED"/>
+                <w:sz w:val="22"/>
+              </w:rPr>
+              <w:t>🌸 OPSI TAMBAHAN MISHKA: CHECKPOINT 2 MINI TEST JIKA MEMBAHAS USIA BALIGH PEREMPUAN</w:t>
               <w:br/>
             </w:r>
             <w:r>
@@ -627,10 +597,10 @@
                 <w:rFonts w:ascii="Calibri" w:hAnsi="Calibri"/>
                 <w:b/>
                 <w:i w:val="0"/>
-                <w:color w:val="047857"/>
+                <w:color w:val="7C3AED"/>
                 <w:sz w:val="19"/>
               </w:rPr>
-              <w:t>Soal 3 (Level C4 - Analisis Keunggulan Sedekah Non-Materi):</w:t>
+              <w:t>SOAL 1 (Level C3 - Klasifikasi Transformasi Raga Biologi vs Ciri Fikih Perempuan):</w:t>
               <w:br/>
             </w:r>
             <w:r>
@@ -640,15 +610,17 @@
                 <w:i w:val="0"/>
                 <w:sz w:val="18"/>
               </w:rPr>
-              <w:t>Faris ingin bersedekah tapi tidak punya uang jajan lebih. Solusi paling tepat dan bijak yang diajarkan Islam agar Faris tetap bisa menjadi ahli sedekah terbaik adalah...</w:t>
+              <w:t>Mishka mempelajari bahwa Allah Swt. menciptakan keindahan proses kedewasaan bagi seorang muslimah dengan tanda-tanda yang khas. Manakah di bawah ini yang merupakan perpaduan antara transformasi raga secara biologi dan ciri sah kedewasaan secara ilmu fikih bagi anak perempuan?</w:t>
               <w:br/>
-              <w:t>A. Memaksakan diri meminjam uang teman demi bisa berinfak ke masjid</w:t>
+              <w:t>A. Suara bertambah dalam berat (biologi) dan suka berolahraga senam (fikih).</w:t>
               <w:br/>
-              <w:t>B. Bersedih hati dan merasa pintu surga sedekah hanya untuk orang kaya</w:t>
+              <w:t>B. Pinggul bertambah lebar dan kelenjar keringat aktif (biologi), serta mengalami menstruasi / haid pertama kali (Al-Haidh) (fikih).  [KUNCI: B]</w:t>
               <w:br/>
-              <w:t>C. Mempraktikkan sedekah non-materi: senyuman santun, tutur kata menyejukkan hati, membantu tenaga, dan membuang sampah/halangan di jalanan  [KUNCI: C]</w:t>
+              <w:t>C. Pertumbuhan tinggi badan (biologi) dan mendapat nilai rapor yang bagus di sekolah (fikih).</w:t>
               <w:br/>
-              <w:t>D. Tidak perlu beramal apa pun sampai kelak menjadi orang dewasa yang sukses</w:t>
+              <w:t>D. Memiliki hobi baru melukis (biologi) dan genap berusia 7 tahun (fikih).</w:t>
+              <w:br/>
+              <w:t>💡 Pembahasan: Sains biologi menjelaskan perubahan fisik perempuan (pinggul melebar, kelenjar keringat aktif). Sedangkan ilmu fikih menetapkan haid (al-haidh) sebagai tanda sah perempuan telah memasuki usia baligh.</w:t>
               <w:br/>
               <w:br/>
             </w:r>
@@ -657,10 +629,10 @@
                 <w:rFonts w:ascii="Calibri" w:hAnsi="Calibri"/>
                 <w:b/>
                 <w:i w:val="0"/>
-                <w:color w:val="047857"/>
+                <w:color w:val="7C3AED"/>
                 <w:sz w:val="19"/>
               </w:rPr>
-              <w:t>Soal 4 (Level C4 - Analisis Etika Berbagi 'Tangan di Atas'):</w:t>
+              <w:t>SOAL 2 (Level C4 - Analisis Konsekuensi Syariat Status Mukallafah &amp; Haid):</w:t>
               <w:br/>
             </w:r>
             <w:r>
@@ -670,26 +642,24 @@
                 <w:i w:val="0"/>
                 <w:sz w:val="18"/>
               </w:rPr>
-              <w:t>Seorang pembuat konten membagikan amplop uang kepada tukang becak di jalan, namun menyuruh tukang becak menangis di depan kamera demi penonton medsos. Mengapa tindakan tersebut melanggar adab luhur berbagi dalam Islam?</w:t>
+              <w:t>Nayla adalah seorang siswi yang baru saja mengalami haid pertamanya di hari Rabu. Nayla merasa bingung mengenai kewajiban ibadahnya. Berdasarkan syariat Islam bagi seorang muslimah yang berhadas besar karena haid, tindakan yang benar adalah...</w:t>
               <w:br/>
-              <w:t>A. Karena uang yang diberikan jumlahnya masih terlalu sedikit</w:t>
+              <w:t>A. Tetap melaksanakan salat 5 waktu seperti biasa tanpa perlu mandi wajib.</w:t>
               <w:br/>
-              <w:t>B. Karena merusak kemurnian niat ikhlas (terjangkit riya') dan menginjak-injak martabat serta kehormatan orang yang dibantu  [KUNCI: B]</w:t>
+              <w:t>B. Berhenti melaksanakan salat fardhu dan puasa selama masa darah haid keluar, dan setelah darah haid benar-benar berhenti (bersih), wajib melakukan Mandi Wajib (Ghusl) sebelum kembali mendirikan salat.  [KUNCI: B]</w:t>
               <w:br/>
-              <w:t>C. Karena tukang becak tidak boleh menerima uang di pinggir jalan</w:t>
+              <w:t>C. Tidak boleh masuk sekolah dan tidak boleh berbicara dengan siapa pun selama haid.</w:t>
               <w:br/>
-              <w:t>D. Karena membagikan uang di siang hari dilarang aturan pemerintah</w:t>
+              <w:t>D. Cukup berwudu dengan air hangat setiap kali masuk waktu salat.</w:t>
+              <w:br/>
+              <w:t>💡 Pembahasan: Saat haid, seorang muslimah dilarang salat dan puasa. Setelah masa haid selesai, ia wajib bersuci dengan mandi wajib (ghusl) untuk mengangkat hadas besar agar sah kembali mendirikan salat fardhu.</w:t>
               <w:br/>
             </w:r>
           </w:p>
         </w:tc>
       </w:tr>
     </w:tbl>
-    <w:p>
-      <w:pPr>
-        <w:spacing w:after="60"/>
-      </w:pPr>
-    </w:p>
+    <w:p/>
     <w:sectPr>
       <w:pgSz w:w="12240" w:h="15840"/>
       <w:pgMar w:top="864" w:right="1008" w:bottom="864" w:left="1008" w:header="720" w:footer="720" w:gutter="0"/>

</xml_diff>